<commit_message>
Record authorization slice GitHub and Preview build evidence
</commit_message>
<xml_diff>
--- a/docs/reports/2026-10-15-authorization-evaluator.docx
+++ b/docs/reports/2026-10-15-authorization-evaluator.docx
@@ -1052,7 +1052,62 @@
         <w:t>codex/phase-1-auth-recovery</w:t>
       </w:r>
       <w:r>
-        <w:t>. This slice's source/report commit and push are pending the final document/diff checks; delivery evidence will be appended after push. No merge or production promotion has been performed.</w:t>
+        <w:t xml:space="preserve">. Source/report commit: </w:t>
+      </w:r>
+      <w:r>
+        <w:rPr>
+          <w:rFonts w:ascii="Consolas" w:hAnsi="Consolas"/>
+          <w:sz w:val="20"/>
+        </w:rPr>
+        <w:t>dea0d6f508897355cfaac454dff97b027ce4a5a7</w:t>
+      </w:r>
+      <w:r>
+        <w:t xml:space="preserve">. The push command stalled without terminal output and was interrupted; a non-interactive </w:t>
+      </w:r>
+      <w:r>
+        <w:rPr>
+          <w:rFonts w:ascii="Consolas" w:hAnsi="Consolas"/>
+          <w:sz w:val="20"/>
+        </w:rPr>
+        <w:t>git ls-remote</w:t>
+      </w:r>
+      <w:r>
+        <w:t xml:space="preserve"> subsequently confirmed that exact commit on GitHub. Staged diff validation passed and the user </w:t>
+      </w:r>
+      <w:r>
+        <w:rPr>
+          <w:rFonts w:ascii="Consolas" w:hAnsi="Consolas"/>
+          <w:sz w:val="20"/>
+        </w:rPr>
+        <w:t>next-env.d.ts</w:t>
+      </w:r>
+      <w:r>
+        <w:t xml:space="preserve"> edit remained unstaged. No merge or production promotion was made.</w:t>
+      </w:r>
+    </w:p>
+    <w:p>
+      <w:r>
+        <w:t xml:space="preserve">Current-slice Preview: https://virtual-nhoy63uw4-shadowrootsec-5679.vercel.app Vercel deployment </w:t>
+      </w:r>
+      <w:r>
+        <w:rPr>
+          <w:rFonts w:ascii="Consolas" w:hAnsi="Consolas"/>
+          <w:sz w:val="20"/>
+        </w:rPr>
+        <w:t>BphbmS5cVfmChpLeZcXapJpMY54u</w:t>
+      </w:r>
+      <w:r>
+        <w:t xml:space="preserve"> is Ready for source </w:t>
+      </w:r>
+      <w:r>
+        <w:rPr>
+          <w:rFonts w:ascii="Consolas" w:hAnsi="Consolas"/>
+          <w:sz w:val="20"/>
+        </w:rPr>
+        <w:t>dea0d6f</w:t>
+      </w:r>
+      <w:r>
+        <w:t>, as observed in the project deployment list on 15 October 2026. Chrome used the requested Shadow Root profile. A subsequent deployment-detail/live-page check timed out and reset browser control. The deployment build passes; current Preview UI/API smoke checks are blocked, not passed. No protection setting or authentication bypass was changed. The evaluator is not called by a deployed route, so Ready does not establish hosted role authorization.</w:t>
       </w:r>
     </w:p>
     <w:p>
@@ -1077,12 +1132,42 @@
         <w:t>07af4b1</w:t>
       </w:r>
       <w:r>
-        <w:t>, Ready and sampled on 15 October 2026 at 14:15 UTC. Auth is disabled there. Forgot-password shows the disabled state; guest reset redirects to login. This is earlier evidence and does not verify the current evaluator on a deployed route. Current-slice Preview build/public regression verification remains pending after push.</w:t>
+        <w:t>, Ready and sampled on 15 October 2026 at 14:15 UTC. Auth is disabled there. Forgot-password shows the disabled state; guest reset redirects to login. This is earlier evidence and does not verify the current evaluator on a deployed route.</w:t>
       </w:r>
     </w:p>
     <w:p>
       <w:r>
-        <w:t xml:space="preserve">Existing Production: https://virtual-ink.vercel.app The latest previously tested application source is </w:t>
+        <w:t xml:space="preserve">Existing Production: https://virtual-ink.vercel.app The dashboard now shows Ready deployment </w:t>
+      </w:r>
+      <w:r>
+        <w:rPr>
+          <w:rFonts w:ascii="Consolas" w:hAnsi="Consolas"/>
+          <w:sz w:val="20"/>
+        </w:rPr>
+        <w:t>4oeSmHcDPSgwoDeHXVm3gbefvgMd</w:t>
+      </w:r>
+      <w:r>
+        <w:t xml:space="preserve">, source </w:t>
+      </w:r>
+      <w:r>
+        <w:rPr>
+          <w:rFonts w:ascii="Consolas" w:hAnsi="Consolas"/>
+          <w:sz w:val="20"/>
+        </w:rPr>
+        <w:t>e5ce1cf</w:t>
+      </w:r>
+      <w:r>
+        <w:t xml:space="preserve">, from the separate Web Analytics merge on </w:t>
+      </w:r>
+      <w:r>
+        <w:rPr>
+          <w:rFonts w:ascii="Consolas" w:hAnsi="Consolas"/>
+          <w:sz w:val="20"/>
+        </w:rPr>
+        <w:t>main</w:t>
+      </w:r>
+      <w:r>
+        <w:t xml:space="preserve">. That existing work is preserved and was not tested by this slice. The latest previously tested application source is </w:t>
       </w:r>
       <w:r>
         <w:rPr>
@@ -1092,7 +1177,7 @@
         <w:t>5c55364</w:t>
       </w:r>
       <w:r>
-        <w:t>; it predates this slice. Its public/health/guest checks passed. No production role/file/order workflow is verified, and this slice has not been promoted to Production.</w:t>
+        <w:t>; its public/health/guest checks passed. No production role/file/order workflow is verified, and this slice was not promoted.</w:t>
       </w:r>
     </w:p>
     <w:p>

</xml_diff>